<commit_message>
Update published course materials
</commit_message>
<xml_diff>
--- a/ALL_FILES/BIOL-1_Fall-2026_Syllabus.docx
+++ b/ALL_FILES/BIOL-1_Fall-2026_Syllabus.docx
@@ -1075,9 +1075,13 @@
     </w:tbl>
     <w:p>
       <w:r>
-        <w:t>Four additional laboratory sessions are reserved for later development. Their</w:t>
+        <w:t>One additional laboratory session is reserved for later development. Its</w:t>
         <w:br/>
-        <w:t>topics, protocols, and final reading associations are intentionally TBD:</w:t>
+        <w:t>topic, protocol, and final reading association are intentionally TBD (the two</w:t>
+        <w:br/>
+        <w:t>further reserved sessions and their TBD labs were removed when the September</w:t>
+        <w:br/>
+        <w:t>8-10 closure shifted the course one week later):</w:t>
       </w:r>
     </w:p>
     <w:tbl>
@@ -1129,7 +1133,7 @@
           </w:tcPr>
           <w:p>
             <w:r>
-              <w:t>23</w:t>
+              <w:t>22</w:t>
             </w:r>
           </w:p>
         </w:tc>
@@ -1150,102 +1154,6 @@
           <w:p>
             <w:r>
               <w:t>Lab 17 (TBD)</w:t>
-            </w:r>
-          </w:p>
-        </w:tc>
-      </w:tr>
-      <w:tr>
-        <w:tc>
-          <w:tcPr>
-            <w:tcW w:type="dxa" w:w="2880"/>
-          </w:tcPr>
-          <w:p>
-            <w:r>
-              <w:t>24</w:t>
-            </w:r>
-          </w:p>
-        </w:tc>
-        <w:tc>
-          <w:tcPr>
-            <w:tcW w:type="dxa" w:w="2880"/>
-          </w:tcPr>
-          <w:p>
-            <w:r>
-              <w:t>November 12</w:t>
-            </w:r>
-          </w:p>
-        </w:tc>
-        <w:tc>
-          <w:tcPr>
-            <w:tcW w:type="dxa" w:w="2880"/>
-          </w:tcPr>
-          <w:p>
-            <w:r>
-              <w:t>Lab 18 (TBD)</w:t>
-            </w:r>
-          </w:p>
-        </w:tc>
-      </w:tr>
-      <w:tr>
-        <w:tc>
-          <w:tcPr>
-            <w:tcW w:type="dxa" w:w="2880"/>
-          </w:tcPr>
-          <w:p>
-            <w:r>
-              <w:t>25</w:t>
-            </w:r>
-          </w:p>
-        </w:tc>
-        <w:tc>
-          <w:tcPr>
-            <w:tcW w:type="dxa" w:w="2880"/>
-          </w:tcPr>
-          <w:p>
-            <w:r>
-              <w:t>November 17</w:t>
-            </w:r>
-          </w:p>
-        </w:tc>
-        <w:tc>
-          <w:tcPr>
-            <w:tcW w:type="dxa" w:w="2880"/>
-          </w:tcPr>
-          <w:p>
-            <w:r>
-              <w:t>Lab 19 (TBD)</w:t>
-            </w:r>
-          </w:p>
-        </w:tc>
-      </w:tr>
-      <w:tr>
-        <w:tc>
-          <w:tcPr>
-            <w:tcW w:type="dxa" w:w="2880"/>
-          </w:tcPr>
-          <w:p>
-            <w:r>
-              <w:t>26</w:t>
-            </w:r>
-          </w:p>
-        </w:tc>
-        <w:tc>
-          <w:tcPr>
-            <w:tcW w:type="dxa" w:w="2880"/>
-          </w:tcPr>
-          <w:p>
-            <w:r>
-              <w:t>November 19</w:t>
-            </w:r>
-          </w:p>
-        </w:tc>
-        <w:tc>
-          <w:tcPr>
-            <w:tcW w:type="dxa" w:w="2880"/>
-          </w:tcPr>
-          <w:p>
-            <w:r>
-              <w:t>Comprehensive final preparation</w:t>
             </w:r>
           </w:p>
         </w:tc>

</xml_diff>

<commit_message>
fix(assessment-layout): continuous question numbering in tear-off PDFs; repair practice-test keys; docs
</commit_message>
<xml_diff>
--- a/ALL_FILES/BIOL-1_Fall-2026_Syllabus.docx
+++ b/ALL_FILES/BIOL-1_Fall-2026_Syllabus.docx
@@ -241,10 +241,10 @@
         <w:rPr>
           <w:b/>
         </w:rPr>
-        <w:t>Labs 01-16</w:t>
+        <w:t>Labs 01-17</w:t>
       </w:r>
       <w:r>
-        <w:t>: one hands-on or paper-based lab per content module. Exam-review worksheets are separate non-primary review materials.</w:t>
+        <w:t>: one hands-on or paper-based lab per content module, with Lab 17 (Capstone Systems Synthesis) paired with Module 16. Exam-review worksheets are separate non-primary review materials.</w:t>
       </w:r>
     </w:p>
     <w:p>
@@ -595,7 +595,7 @@
           </w:tcPr>
           <w:p>
             <w:r>
-              <w:t>Lab 05</w:t>
+              <w:t>Lab 06</w:t>
             </w:r>
           </w:p>
         </w:tc>
@@ -637,7 +637,7 @@
           </w:tcPr>
           <w:p>
             <w:r>
-              <w:t>Lab 06</w:t>
+              <w:t>Lab 07</w:t>
             </w:r>
           </w:p>
         </w:tc>
@@ -679,7 +679,7 @@
           </w:tcPr>
           <w:p>
             <w:r>
-              <w:t>Lab 07</w:t>
+              <w:t>Lab 08</w:t>
             </w:r>
           </w:p>
         </w:tc>
@@ -721,7 +721,7 @@
           </w:tcPr>
           <w:p>
             <w:r>
-              <w:t>Lab 08</w:t>
+              <w:t>Lab 09</w:t>
             </w:r>
           </w:p>
         </w:tc>
@@ -763,7 +763,7 @@
           </w:tcPr>
           <w:p>
             <w:r>
-              <w:t>Lab 09</w:t>
+              <w:t>Lab 10</w:t>
             </w:r>
           </w:p>
         </w:tc>
@@ -805,7 +805,7 @@
           </w:tcPr>
           <w:p>
             <w:r>
-              <w:t>Lab 10</w:t>
+              <w:t>Lab 11</w:t>
             </w:r>
           </w:p>
         </w:tc>
@@ -847,7 +847,7 @@
           </w:tcPr>
           <w:p>
             <w:r>
-              <w:t>Lab 11</w:t>
+              <w:t>Lab 12</w:t>
             </w:r>
           </w:p>
         </w:tc>
@@ -889,7 +889,7 @@
           </w:tcPr>
           <w:p>
             <w:r>
-              <w:t>Lab 12</w:t>
+              <w:t>Lab 13</w:t>
             </w:r>
           </w:p>
         </w:tc>
@@ -931,7 +931,7 @@
           </w:tcPr>
           <w:p>
             <w:r>
-              <w:t>Lab 13</w:t>
+              <w:t>Lab 14</w:t>
             </w:r>
           </w:p>
         </w:tc>
@@ -973,7 +973,7 @@
           </w:tcPr>
           <w:p>
             <w:r>
-              <w:t>Lab 14</w:t>
+              <w:t>Lab 15</w:t>
             </w:r>
           </w:p>
         </w:tc>
@@ -1015,7 +1015,7 @@
           </w:tcPr>
           <w:p>
             <w:r>
-              <w:t>Lab 15</w:t>
+              <w:t>Lab 16</w:t>
             </w:r>
           </w:p>
         </w:tc>
@@ -1057,7 +1057,7 @@
           </w:tcPr>
           <w:p>
             <w:r>
-              <w:t>Lab 16</w:t>
+              <w:t>Lab 17</w:t>
             </w:r>
           </w:p>
         </w:tc>
@@ -1075,13 +1075,15 @@
     </w:tbl>
     <w:p>
       <w:r>
-        <w:t>One additional laboratory session is reserved for later development. Its</w:t>
+        <w:t>All 17 laboratory sessions are now developed; no TBD lab sessions remain (the</w:t>
         <w:br/>
-        <w:t>topic, protocol, and final reading association are intentionally TBD (the two</w:t>
+        <w:t>two further reserved sessions and their TBD labs were removed when the</w:t>
         <w:br/>
-        <w:t>further reserved sessions and their TBD labs were removed when the September</w:t>
+        <w:t>September 8-10 closure shifted the course one week later). The November 10</w:t>
         <w:br/>
-        <w:t>8-10 closure shifted the course one week later):</w:t>
+        <w:t>session is Lab 17: Capstone Systems Synthesis, paired with Module 16 and its</w:t>
+        <w:br/>
+        <w:t>cumulative selected readings:</w:t>
       </w:r>
     </w:p>
     <w:tbl>
@@ -1153,7 +1155,7 @@
           </w:tcPr>
           <w:p>
             <w:r>
-              <w:t>Lab 17 (TBD)</w:t>
+              <w:t>Lab 17: Capstone Systems Synthesis</w:t>
             </w:r>
           </w:p>
         </w:tc>

</xml_diff>

<commit_message>
fix(biol-1): clarify Unit 3 and deliver complete PDF/DOCX handouts
Align Modules 12–16, Labs 13–17, practice review and Exam 03. Preserve lab table content and Word numbering, writing space and worksheet fields. Generate lab/review/practice DOCX, use canonical lab pairing in module bundles, and exclude disabled lecture media from publication and dated handoffs. Regenerate course outputs and record verification and private Downloads handoff.
</commit_message>
<xml_diff>
--- a/ALL_FILES/BIOL-1_Fall-2026_Syllabus.docx
+++ b/ALL_FILES/BIOL-1_Fall-2026_Syllabus.docx
@@ -27,6 +27,9 @@
       </w:r>
     </w:p>
     <w:p>
+      <w:pPr>
+        <w:keepLines/>
+      </w:pPr>
       <w:r>
         <w:t xml:space="preserve">• </w:t>
       </w:r>
@@ -41,6 +44,9 @@
       </w:r>
     </w:p>
     <w:p>
+      <w:pPr>
+        <w:keepLines/>
+      </w:pPr>
       <w:r>
         <w:t xml:space="preserve">• </w:t>
       </w:r>
@@ -55,6 +61,9 @@
       </w:r>
     </w:p>
     <w:p>
+      <w:pPr>
+        <w:keepLines/>
+      </w:pPr>
       <w:r>
         <w:t xml:space="preserve">• </w:t>
       </w:r>
@@ -69,6 +78,9 @@
       </w:r>
     </w:p>
     <w:p>
+      <w:pPr>
+        <w:keepLines/>
+      </w:pPr>
       <w:r>
         <w:t xml:space="preserve">• </w:t>
       </w:r>
@@ -92,6 +104,10 @@
       </w:r>
     </w:p>
     <w:p>
+      <w:pPr>
+        <w:keepNext/>
+        <w:keepLines/>
+      </w:pPr>
       <w:r>
         <w:t xml:space="preserve">• </w:t>
       </w:r>
@@ -106,17 +122,21 @@
       </w:r>
     </w:p>
     <w:p>
+      <w:pPr>
+        <w:keepNext w:val="0"/>
+        <w:keepLines/>
+      </w:pPr>
       <w:r>
         <w:t xml:space="preserve">• </w:t>
-      </w:r>
-      <w:r>
-        <w:br/>
       </w:r>
       <w:r>
         <w:t>Tuesday and Thursday, 05:30PM - 08:40PM</w:t>
       </w:r>
     </w:p>
     <w:p>
+      <w:pPr>
+        <w:keepLines/>
+      </w:pPr>
       <w:r>
         <w:t xml:space="preserve">• </w:t>
       </w:r>
@@ -131,6 +151,9 @@
       </w:r>
     </w:p>
     <w:p>
+      <w:pPr>
+        <w:keepLines/>
+      </w:pPr>
       <w:r>
         <w:t xml:space="preserve">• </w:t>
       </w:r>
@@ -145,6 +168,9 @@
       </w:r>
     </w:p>
     <w:p>
+      <w:pPr>
+        <w:keepLines/>
+      </w:pPr>
       <w:r>
         <w:t xml:space="preserve">• </w:t>
       </w:r>
@@ -168,7 +194,7 @@
     </w:p>
     <w:p>
       <w:r>
-        <w:t xml:space="preserve">An introductory course in life science dealing with basic biological concepts including molecular and cell biology, metabolism, heredity, evolution, ecology, natural history, and biodiversity. </w:t>
+        <w:t>An introductory course in life science dealing with basic biological concepts including molecular and cell biology, metabolism, heredity, evolution, ecology, natural history, and biodiversity.</w:t>
       </w:r>
     </w:p>
     <w:p>
@@ -180,6 +206,9 @@
       </w:r>
     </w:p>
     <w:p>
+      <w:pPr>
+        <w:keepLines/>
+      </w:pPr>
       <w:r>
         <w:t xml:space="preserve">1. </w:t>
       </w:r>
@@ -188,6 +217,9 @@
       </w:r>
     </w:p>
     <w:p>
+      <w:pPr>
+        <w:keepLines/>
+      </w:pPr>
       <w:r>
         <w:t xml:space="preserve">2. </w:t>
       </w:r>
@@ -196,6 +228,9 @@
       </w:r>
     </w:p>
     <w:p>
+      <w:pPr>
+        <w:keepLines/>
+      </w:pPr>
       <w:r>
         <w:t xml:space="preserve">3. </w:t>
       </w:r>
@@ -217,6 +252,9 @@
       </w:r>
     </w:p>
     <w:p>
+      <w:pPr>
+        <w:keepLines/>
+      </w:pPr>
       <w:r>
         <w:t xml:space="preserve">• </w:t>
       </w:r>
@@ -231,6 +269,9 @@
       </w:r>
     </w:p>
     <w:p>
+      <w:pPr>
+        <w:keepLines/>
+      </w:pPr>
       <w:r>
         <w:t xml:space="preserve">• </w:t>
       </w:r>
@@ -245,6 +286,9 @@
       </w:r>
     </w:p>
     <w:p>
+      <w:pPr>
+        <w:keepLines/>
+      </w:pPr>
       <w:r>
         <w:t xml:space="preserve">• </w:t>
       </w:r>
@@ -259,6 +303,9 @@
       </w:r>
     </w:p>
     <w:p>
+      <w:pPr>
+        <w:keepLines/>
+      </w:pPr>
       <w:r>
         <w:t xml:space="preserve">• </w:t>
       </w:r>
@@ -1184,6 +1231,9 @@
       </w:r>
     </w:p>
     <w:p>
+      <w:pPr>
+        <w:keepLines/>
+      </w:pPr>
       <w:r>
         <w:t xml:space="preserve">• </w:t>
       </w:r>
@@ -1198,6 +1248,9 @@
       </w:r>
     </w:p>
     <w:p>
+      <w:pPr>
+        <w:keepLines/>
+      </w:pPr>
       <w:r>
         <w:t xml:space="preserve">• </w:t>
       </w:r>
@@ -1212,6 +1265,9 @@
       </w:r>
     </w:p>
     <w:p>
+      <w:pPr>
+        <w:keepLines/>
+      </w:pPr>
       <w:r>
         <w:t xml:space="preserve">• </w:t>
       </w:r>
@@ -1277,6 +1333,9 @@
       </w:r>
     </w:p>
     <w:p>
+      <w:pPr>
+        <w:keepLines/>
+      </w:pPr>
       <w:r>
         <w:t xml:space="preserve">• </w:t>
       </w:r>
@@ -1285,6 +1344,9 @@
       </w:r>
     </w:p>
     <w:p>
+      <w:pPr>
+        <w:keepLines/>
+      </w:pPr>
       <w:r>
         <w:t xml:space="preserve">• </w:t>
       </w:r>
@@ -1293,6 +1355,9 @@
       </w:r>
     </w:p>
     <w:p>
+      <w:pPr>
+        <w:keepLines/>
+      </w:pPr>
       <w:r>
         <w:t xml:space="preserve">• </w:t>
       </w:r>
@@ -1301,6 +1366,9 @@
       </w:r>
     </w:p>
     <w:p>
+      <w:pPr>
+        <w:keepLines/>
+      </w:pPr>
       <w:r>
         <w:t xml:space="preserve">• </w:t>
       </w:r>
@@ -1309,6 +1377,9 @@
       </w:r>
     </w:p>
     <w:p>
+      <w:pPr>
+        <w:keepLines/>
+      </w:pPr>
       <w:r>
         <w:t xml:space="preserve">• </w:t>
       </w:r>
@@ -1802,7 +1873,7 @@
       <w:rFonts w:asciiTheme="majorHAnsi" w:eastAsiaTheme="majorEastAsia" w:hAnsiTheme="majorHAnsi" w:cstheme="majorBidi"/>
       <w:b/>
       <w:bCs/>
-      <w:color w:val="365F91" w:themeColor="accent1" w:themeShade="BF"/>
+      <w:color w:val="000000"/>
       <w:sz w:val="28"/>
       <w:szCs w:val="28"/>
     </w:rPr>
@@ -1826,7 +1897,7 @@
       <w:rFonts w:asciiTheme="majorHAnsi" w:eastAsiaTheme="majorEastAsia" w:hAnsiTheme="majorHAnsi" w:cstheme="majorBidi"/>
       <w:b/>
       <w:bCs/>
-      <w:color w:val="4F81BD" w:themeColor="accent1"/>
+      <w:color w:val="000000"/>
       <w:sz w:val="26"/>
       <w:szCs w:val="26"/>
     </w:rPr>
@@ -1850,7 +1921,7 @@
       <w:rFonts w:asciiTheme="majorHAnsi" w:eastAsiaTheme="majorEastAsia" w:hAnsiTheme="majorHAnsi" w:cstheme="majorBidi"/>
       <w:b/>
       <w:bCs/>
-      <w:color w:val="4F81BD" w:themeColor="accent1"/>
+      <w:color w:val="000000"/>
     </w:rPr>
   </w:style>
   <w:style w:type="paragraph" w:styleId="Heading4">
@@ -1875,7 +1946,7 @@
       <w:bCs/>
       <w:i/>
       <w:iCs/>
-      <w:color w:val="4F81BD" w:themeColor="accent1"/>
+      <w:color w:val="000000"/>
     </w:rPr>
   </w:style>
   <w:style w:type="paragraph" w:styleId="Heading5">
@@ -1896,7 +1967,7 @@
     </w:pPr>
     <w:rPr>
       <w:rFonts w:asciiTheme="majorHAnsi" w:eastAsiaTheme="majorEastAsia" w:hAnsiTheme="majorHAnsi" w:cstheme="majorBidi"/>
-      <w:color w:val="243F60" w:themeColor="accent1" w:themeShade="7F"/>
+      <w:color w:val="000000"/>
     </w:rPr>
   </w:style>
   <w:style w:type="paragraph" w:styleId="Heading6">
@@ -1919,7 +1990,7 @@
       <w:rFonts w:asciiTheme="majorHAnsi" w:eastAsiaTheme="majorEastAsia" w:hAnsiTheme="majorHAnsi" w:cstheme="majorBidi"/>
       <w:i/>
       <w:iCs/>
-      <w:color w:val="243F60" w:themeColor="accent1" w:themeShade="7F"/>
+      <w:color w:val="000000"/>
     </w:rPr>
   </w:style>
   <w:style w:type="paragraph" w:styleId="Heading7">
@@ -2089,7 +2160,7 @@
     </w:pPr>
     <w:rPr>
       <w:rFonts w:asciiTheme="majorHAnsi" w:eastAsiaTheme="majorEastAsia" w:hAnsiTheme="majorHAnsi" w:cstheme="majorBidi"/>
-      <w:color w:val="17365D" w:themeColor="text2" w:themeShade="BF"/>
+      <w:color w:val="000000"/>
       <w:spacing w:val="5"/>
       <w:kern w:val="28"/>
       <w:sz w:val="52"/>
@@ -2128,7 +2199,7 @@
       <w:rFonts w:asciiTheme="majorHAnsi" w:eastAsiaTheme="majorEastAsia" w:hAnsiTheme="majorHAnsi" w:cstheme="majorBidi"/>
       <w:i/>
       <w:iCs/>
-      <w:color w:val="4F81BD" w:themeColor="accent1"/>
+      <w:color w:val="000000"/>
       <w:spacing w:val="15"/>
       <w:sz w:val="24"/>
       <w:szCs w:val="24"/>

</xml_diff>